<commit_message>
docs(examples): regenerate the visualize guide with the current CLI (6)
Co-Authored-By: Claude Opus 5.5 <noreply@anthropic.com>
Claude-Session: https://claude.ai/code/session_011bYN5QY25n4bVER1Pv4xvv
</commit_message>
<xml_diff>
--- a/examples/cli/visualize/out/received.docx
+++ b/examples/cli/visualize/out/received.docx
@@ -47,42 +47,42 @@
       <w:r>
         <w:t xml:space="preserve"> route-cost reports and a </w:t>
       </w:r>
-      <w:del w:id="2" w:author="Ann Counsel" w:date="2026-10-01T09:00:00Z">
+      <w:ins w:id="2" w:author="Ann Counsel" w:date="2026-10-01T09:00:00Z">
+        <w:r>
+          <w:t xml:space="preserve">monthly</w:t>
+        </w:r>
+      </w:ins>
+      <w:del w:id="3" w:author="Ann Counsel" w:date="2026-10-01T09:00:00Z">
         <w:r>
           <w:delText xml:space="preserve">weekly</w:delText>
         </w:r>
       </w:del>
-      <w:ins w:id="3" w:author="Ann Counsel" w:date="2026-10-01T09:00:00Z">
-        <w:r>
-          <w:t xml:space="preserve">monthly</w:t>
+      <w:r>
+        <w:t xml:space="preserve"> review call.</w:t>
+      </w:r>
+    </w:p>
+    <w:p>
+      <w:pPr>
+        <w:pStyle w:val="Heading2"/>
+      </w:pPr>
+      <w:r>
+        <w:t xml:space="preserve">2. Fees</w:t>
+      </w:r>
+    </w:p>
+    <w:p>
+      <w:r>
+        <w:t xml:space="preserve">Client shall pay each invoice within </w:t>
+      </w:r>
+      <w:ins w:id="4" w:author="Ann Counsel" w:date="2026-10-01T09:00:00Z">
+        <w:r>
+          <w:t xml:space="preserve">forty-five</w:t>
         </w:r>
       </w:ins>
-      <w:r>
-        <w:t xml:space="preserve"> review call.</w:t>
-      </w:r>
-    </w:p>
-    <w:p>
-      <w:pPr>
-        <w:pStyle w:val="Heading2"/>
-      </w:pPr>
-      <w:r>
-        <w:t xml:space="preserve">2. Fees</w:t>
-      </w:r>
-    </w:p>
-    <w:p>
-      <w:r>
-        <w:t xml:space="preserve">Client shall pay each invoice within </w:t>
-      </w:r>
-      <w:del w:id="4" w:author="Ann Counsel" w:date="2026-10-01T09:00:00Z">
+      <w:del w:id="5" w:author="Ann Counsel" w:date="2026-10-01T09:00:00Z">
         <w:r>
           <w:delText xml:space="preserve">thirty</w:delText>
         </w:r>
       </w:del>
-      <w:ins w:id="5" w:author="Ann Counsel" w:date="2026-10-01T09:00:00Z">
-        <w:r>
-          <w:t xml:space="preserve">forty-five</w:t>
-        </w:r>
-      </w:ins>
       <w:r>
         <w:t xml:space="preserve"> days of receipt.</w:t>
       </w:r>
@@ -135,7 +135,6 @@
     </w:p>
     <w:tbl>
       <w:tblPr>
-        <w:tblStyle w:val="TableGrid"/>
         <w:tblW w:w="5000" w:type="pct"/>
         <w:tblLook w:val="04A0" w:firstRow="1" w:lastRow="0" w:firstColumn="1" w:lastColumn="0" w:noHBand="0" w:noVBand="1"/>
       </w:tblPr>
@@ -195,16 +194,16 @@
             <w:tcW w:w="3120" w:type="dxa"/>
           </w:tcPr>
           <w:p>
-            <w:del w:id="8" w:author="Ann Counsel" w:date="2026-10-01T09:00:00Z">
+            <w:ins w:id="8" w:author="Ann Counsel" w:date="2026-10-01T09:00:00Z">
+              <w:r>
+                <w:t xml:space="preserve">Day 15</w:t>
+              </w:r>
+            </w:ins>
+            <w:del w:id="9" w:author="Ann Counsel" w:date="2026-10-01T09:00:00Z">
               <w:r>
                 <w:delText xml:space="preserve">Day 10</w:delText>
               </w:r>
             </w:del>
-            <w:ins w:id="9" w:author="Ann Counsel" w:date="2026-10-01T09:00:00Z">
-              <w:r>
-                <w:t xml:space="preserve">Day 15</w:t>
-              </w:r>
-            </w:ins>
           </w:p>
         </w:tc>
         <w:tc>
@@ -412,24 +411,6 @@
     <w:name w:val="Normal"/>
     <w:qFormat/>
   </w:style>
-  <w:style w:type="table" w:styleId="TableGrid">
-    <w:name w:val="Table Grid"/>
-    <w:basedOn w:val="TableNormal"/>
-    <w:uiPriority w:val="39"/>
-    <w:pPr>
-      <w:spacing w:after="0" w:line="240" w:lineRule="auto"/>
-    </w:pPr>
-    <w:tblPr>
-      <w:tblBorders>
-        <w:top w:val="single" w:sz="4" w:space="0" w:color="auto"/>
-        <w:left w:val="single" w:sz="4" w:space="0" w:color="auto"/>
-        <w:bottom w:val="single" w:sz="4" w:space="0" w:color="auto"/>
-        <w:right w:val="single" w:sz="4" w:space="0" w:color="auto"/>
-        <w:insideH w:val="single" w:sz="4" w:space="0" w:color="auto"/>
-        <w:insideV w:val="single" w:sz="4" w:space="0" w:color="auto"/>
-      </w:tblBorders>
-    </w:tblPr>
-  </w:style>
   <w:style w:type="table" w:default="1" w:styleId="TableNormal">
     <w:name w:val="Normal Table"/>
     <w:uiPriority w:val="99"/>

</xml_diff>